<commit_message>
Memoria final de la Actividad Practica 1
</commit_message>
<xml_diff>
--- a/docs/Memoria_AP1_13MBID_borrador.docx
+++ b/docs/Memoria_AP1_13MBID_borrador.docx
@@ -1949,10 +1949,10 @@
         <w:tblLook w:val="04A0" w:firstRow="1" w:lastRow="0" w:firstColumn="1" w:lastColumn="0" w:noHBand="0" w:noVBand="1"/>
       </w:tblPr>
       <w:tblGrid>
-        <w:gridCol w:w="834"/>
-        <w:gridCol w:w="6007"/>
-        <w:gridCol w:w="1256"/>
-        <w:gridCol w:w="2199"/>
+        <w:gridCol w:w="835"/>
+        <w:gridCol w:w="6021"/>
+        <w:gridCol w:w="1258"/>
+        <w:gridCol w:w="2182"/>
       </w:tblGrid>
       <w:tr>
         <w:trPr>
@@ -2473,7 +2473,7 @@
               <w:rPr>
                 <w:sz w:val="18"/>
               </w:rPr>
-              <w:t>En revisión</w:t>
+              <w:t>Hecho</w:t>
             </w:r>
           </w:p>
         </w:tc>
@@ -2548,7 +2548,7 @@
               <w:rPr>
                 <w:sz w:val="18"/>
               </w:rPr>
-              <w:t>Pendiente del estudiante</w:t>
+              <w:t>Hecho</w:t>
             </w:r>
           </w:p>
         </w:tc>

</xml_diff>